<commit_message>
Clarify validated model framing
</commit_message>
<xml_diff>
--- a/report/chicken_sales_time_series_report.docx
+++ b/report/chicken_sales_time_series_report.docx
@@ -5271,7 +5271,7 @@
         <w:jc w:val="both"/>
       </w:pPr>
       <w:r>
-        <w:t>The selected model achieved an aggregate RMSE of 5.604 and MAE of 4.528. Its RMSE was 14.8% lower than that of the eligible runner-up and 5.0% lower than the random-walk-with-drift benchmark. The seasonal-naive benchmark performed substantially worse, with an aggregate RMSE of 11.509.</w:t>
+        <w:t>The selected model provided the best validated forecast performance among the eligible candidates, with an aggregate RMSE of 5.604 and MAE of 4.528. Its RMSE was 14.8% lower than that of the eligible runner-up and 5.0% lower than the random-walk-with-drift benchmark. The seasonal-naive benchmark performed substantially worse, with an aggregate RMSE of 11.509.</w:t>
       </w:r>
     </w:p>
     <w:p>
@@ -6829,7 +6829,7 @@
         <w:jc w:val="both"/>
       </w:pPr>
       <w:r>
-        <w:t>The SARIMA(2,1,0) x (1,0,1)[12] model without drift was selected for forecasting. It is one of only two specifications that satisfied every coefficient, root, and residual condition, and it produced the lowest aggregate validation RMSE among the eligible models. The seasonal MA term provides a material forecast improvement over the simpler runner-up rather than adding complexity without measurable value.</w:t>
+        <w:t>The SARIMA(2,1,0) x (1,0,1)[12] model without drift was selected because it provided the best validated forecast performance among the eligible candidates. It is one of only two specifications that satisfied every coefficient, root, and residual condition. The seasonal MA term provides a material forecast improvement over the simpler runner-up rather than adding complexity without measurable value.</w:t>
       </w:r>
     </w:p>
     <w:p>
@@ -6838,7 +6838,7 @@
         <w:jc w:val="both"/>
       </w:pPr>
       <w:r>
-        <w:t>The minimum fitted AR root is 1.002, which remains outside the unit circle but is close to its boundary. This result indicates strong seasonal persistence and helps explain why uncertainty expands across the forecast horizon. The root is treated as an important model characteristic rather than a violation of stationarity.</w:t>
+        <w:t>The minimum fitted AR root is 1.002, which remains outside the unit circle but is close to its boundary. This near-unit seasonal root makes the fitted process highly persistent and somewhat sensitive to small changes in the data or model specification. It is therefore treated as an important model characteristic that warrants cautious interpretation rather than as a violation of stationarity.</w:t>
       </w:r>
     </w:p>
     <w:p>

</xml_diff>